<commit_message>
profile page after register V1
</commit_message>
<xml_diff>
--- a/mongoDB/Mongodb_Jubilee_database.docx
+++ b/mongoDB/Mongodb_Jubilee_database.docx
@@ -43,6 +43,68 @@
           <w:lang w:val="en-US"/>
         </w:rPr>
       </w:pPr>
+      <w:r>
+        <w:rPr>
+          <w:lang w:val="en-US"/>
+        </w:rPr>
+        <w:t xml:space="preserve">Connection string: </w:t>
+      </w:r>
+      <w:proofErr w:type="spellStart"/>
+      <w:r>
+        <w:rPr>
+          <w:lang w:val="en-US"/>
+        </w:rPr>
+        <w:t>mongosh</w:t>
+      </w:r>
+      <w:proofErr w:type="spellEnd"/>
+      <w:r>
+        <w:rPr>
+          <w:lang w:val="en-US"/>
+        </w:rPr>
+        <w:t xml:space="preserve"> "</w:t>
+      </w:r>
+      <w:proofErr w:type="spellStart"/>
+      <w:r>
+        <w:rPr>
+          <w:lang w:val="en-US"/>
+        </w:rPr>
+        <w:t>mongodb+srv</w:t>
+      </w:r>
+      <w:proofErr w:type="spellEnd"/>
+      <w:r>
+        <w:rPr>
+          <w:lang w:val="en-US"/>
+        </w:rPr>
+        <w:t>://clusterj.equocxz.mongodb.net/" --</w:t>
+      </w:r>
+      <w:proofErr w:type="spellStart"/>
+      <w:r>
+        <w:rPr>
+          <w:lang w:val="en-US"/>
+        </w:rPr>
+        <w:t>apiVersion</w:t>
+      </w:r>
+      <w:proofErr w:type="spellEnd"/>
+      <w:r>
+        <w:rPr>
+          <w:lang w:val="en-US"/>
+        </w:rPr>
+        <w:t xml:space="preserve"> 1 --username </w:t>
+      </w:r>
+      <w:proofErr w:type="spellStart"/>
+      <w:r>
+        <w:rPr>
+          <w:lang w:val="en-US"/>
+        </w:rPr>
+        <w:t>gmostertpot</w:t>
+      </w:r>
+      <w:proofErr w:type="spellEnd"/>
+      <w:r>
+        <w:rPr>
+          <w:lang w:val="en-US"/>
+        </w:rPr>
+        <w:t xml:space="preserve"> </w:t>
+      </w:r>
     </w:p>
     <w:p>
       <w:pPr>

</xml_diff>